<commit_message>
Add LinkedIn URL to portfolio footer and Word doc resume; update resume contact line
</commit_message>
<xml_diff>
--- a/Bhargavi_Nimmagadda_Resume.docx
+++ b/Bhargavi_Nimmagadda_Resume.docx
@@ -46,7 +46,7 @@
           <w:sz w:val="20"/>
           <w:szCs w:val="20"/>
         </w:rPr>
-        <w:t xml:space="preserve">Newark, DE  |  +1 (267) 407-1988  |  bhargavinchowdary@gmail.com  |  Open to Relocation</w:t>
+        <w:t>Newark, DE  |  +1 (267) 407-1988  |  bhargavinchowdary@gmail.com  |  linkedin.com/in/bhargavi-chowdary-96ab14403  |  Open to Relocation</w:t>
       </w:r>
     </w:p>
     <w:p>
@@ -167,7 +167,7 @@
           <w:sz w:val="22"/>
           <w:szCs w:val="22"/>
         </w:rPr>
-        <w:t xml:space="preserve">Fiserv Fraud Detection · Actimize (exposure) · Case Management Systems · Jira · ServiceNow · Splunk · CRM Tools · Microsoft Excel (Pivot, VLOOKUP, XLOOKUP, Macros) · Tableau · Power BI</w:t>
+        <w:t>JPMorgan Chase &amp; Co. Fraud Detection · Actimize (exposure) · Case Management Systems · Jira · ServiceNow · Splunk · CRM Tools · Microsoft Excel (Pivot, VLOOKUP, XLOOKUP, Macros) · Tableau · Power BI</w:t>
       </w:r>
     </w:p>
     <w:p>
@@ -260,7 +260,7 @@
           <w:sz w:val="22"/>
           <w:szCs w:val="22"/>
         </w:rPr>
-        <w:t xml:space="preserve">Fiserv</w:t>
+        <w:t>JPMorgan Chase &amp; Co.</w:t>
       </w:r>
       <w:r>
         <w:rPr>
@@ -288,7 +288,7 @@
           <w:sz w:val="22"/>
           <w:szCs w:val="22"/>
         </w:rPr>
-        <w:t xml:space="preserve">Monitor real-time card, ACH, debit, and merchant transactions on Fiserv fraud detection platforms, reviewing 10,000+ transactions weekly across high-velocity payment channels.</w:t>
+        <w:t>Monitor real-time card, ACH, debit, and merchant transactions on JPMorgan Chase &amp; Co. fraud detection platforms, reviewing 10,000+ transactions weekly across high-velocity payment channels.</w:t>
       </w:r>
     </w:p>
     <w:p>
@@ -442,7 +442,7 @@
           <w:sz w:val="22"/>
           <w:szCs w:val="22"/>
         </w:rPr>
-        <w:t xml:space="preserve">Genpact (HDFC Bank Process)</w:t>
+        <w:t>Goldman Sachs</w:t>
       </w:r>
       <w:r>
         <w:rPr>
@@ -470,7 +470,7 @@
           <w:sz w:val="22"/>
           <w:szCs w:val="22"/>
         </w:rPr>
-        <w:t xml:space="preserve">Performed KYC verification for 100+ retail and corporate banking customers daily, reviewing government IDs, address proofs, and beneficial-ownership documentation in line with RBI and AML guidelines.</w:t>
+        <w:t>Performed KYC verification for 100+ retail and corporate banking customers daily, reviewing government IDs, address proofs, and beneficial-ownership documentation in line with SEC, RBI and AML guidelines.</w:t>
       </w:r>
     </w:p>
     <w:p>
@@ -771,7 +771,7 @@
           <w:sz w:val="22"/>
           <w:szCs w:val="22"/>
         </w:rPr>
-        <w:t xml:space="preserve">Wilmington University, Delaware, USA</w:t>
+        <w:t>Wilmington University, New Castle, Delaware, USA</w:t>
       </w:r>
     </w:p>
     <w:p>

</xml_diff>